<commit_message>
RA2: dossiers anomenats Activitats, exercici 7 de SMART a l'A2.2 i diapositives/temari de l'AA2; Puig Castellar Tech també a RA3 i RA4
- A2.1/A2.2/A2.3: títol i fitxer «Activitats»; el títol del terminal es fixa tancant el pop-up.
- A2.2: exercici 7 (paràmetres de l'emmagatzematge i SMART) amb comprovació real de smartctl a IsardVDI.
- RA2_AA2: diapositives noves (paràmetres, mètriques, HDD/SSD/NVMe, SMART, local vs núvol) i T02 ampliat.
- RA3 A3.3 i RA4 A4.3 + RA4_AA3: EverPia -> Puig Castellar Tech, amb captures OpenSSL refetes.

Co-Authored-By: Claude Opus 5.5 <noreply@anthropic.com>
Claude-Session: https://claude.ai/code/session_01BodJZ9PsepvknsFhsdyYkP
</commit_message>
<xml_diff>
--- a/RA2 - Emmagatzematge i copies de seguretat/AA2 - Sistemes demmagatzematge/T02_Temari_Sistemes_emmagatzematge.docx
+++ b/RA2 - Emmagatzematge i copies de seguretat/AA2 - Sistemes demmagatzematge/T02_Temari_Sistemes_emmagatzematge.docx
@@ -138,7 +138,8 @@
         <w:spacing w:after="180" w:before="400"/>
       </w:pPr>
       <w:r>
-        <w:t xml:space="preserve">2. La redundància: no dependre mai d'un sol disc</w:t>
+        <w:rPr/>
+        <w:t xml:space="preserve">2. Paràmetres de l'emmagatzematge: rendiment, disponibilitat i accessibilitat</w:t>
       </w:r>
     </w:p>
     <w:p>
@@ -151,7 +152,7 @@
           <w:sz w:val="22"/>
           <w:szCs w:val="22"/>
         </w:rPr>
-        <w:t xml:space="preserve">Duplicar la informació permet evitar-ne la pèrdua davant l'avaria d'un disc. Aquesta duplicació es pot implementar amb diverses tècniques, que sovint es combinen entre elles per evitar un únic punt de fallada (single point of failure):</w:t>
+        <w:t xml:space="preserve">Abans de triar un sistema d'emmagatzematge, cal saber què li demanem. Hi ha tres paràmetres bàsics:</w:t>
       </w:r>
     </w:p>
     <w:p>
@@ -165,10 +166,18 @@
       </w:pPr>
       <w:r>
         <w:rPr>
-          <w:sz w:val="22"/>
-          <w:szCs w:val="22"/>
-        </w:rPr>
-        <w:t xml:space="preserve">RAID (Redundant Array of Independent Disks): combina diverses unitats d'emmagatzematge en una sola unitat lògica. És redundància LOCAL, dins del mateix equip.</w:t>
+          <w:b/>
+          <w:sz w:val="22"/>
+          <w:szCs w:val="22"/>
+        </w:rPr>
+        <w:t xml:space="preserve">Rendiment: </w:t>
+      </w:r>
+      <w:r>
+        <w:rPr>
+          <w:sz w:val="22"/>
+          <w:szCs w:val="22"/>
+        </w:rPr>
+        <w:t xml:space="preserve">que llegeixi i escrigui les dades ràpidament. Es mesura amb la latència, les IOPS i el throughput.</w:t>
       </w:r>
     </w:p>
     <w:p>
@@ -182,10 +191,18 @@
       </w:pPr>
       <w:r>
         <w:rPr>
-          <w:sz w:val="22"/>
-          <w:szCs w:val="22"/>
-        </w:rPr>
-        <w:t xml:space="preserve">Sistemes d'emmagatzematge en xarxa: proporcionen redundància a nivell de xarxa local (més d'un servidor o cabina de discos). Internament, aquests sistemes ja fan servir RAID.</w:t>
+          <w:b/>
+          <w:sz w:val="22"/>
+          <w:szCs w:val="22"/>
+        </w:rPr>
+        <w:t xml:space="preserve">Disponibilitat: </w:t>
+      </w:r>
+      <w:r>
+        <w:rPr>
+          <w:sz w:val="22"/>
+          <w:szCs w:val="22"/>
+        </w:rPr>
+        <w:t xml:space="preserve">que el sistema continuï funcionant encara que alguna peça falli. S'aconsegueix amb redundància (RAID, sistemes duplicats), protecció elèctrica (SAI) i monitoratge dels discos.</w:t>
       </w:r>
     </w:p>
     <w:p>
@@ -199,32 +216,28 @@
       </w:pPr>
       <w:r>
         <w:rPr>
-          <w:sz w:val="22"/>
-          <w:szCs w:val="22"/>
-        </w:rPr>
-        <w:t xml:space="preserve">Serveis de núvol: com Dropbox, Google Drive o OneDrive, que mantenen la informació "duplicada" a Internet. Són molt atractius per a l'ús domèstic, però cal valorar-ne els aspectes legals, de privacitat i de velocitat de sincronització.</w:t>
-      </w:r>
-    </w:p>
-    <w:p>
-      <w:pPr>
-        <w:pStyle w:val="Heading1"/>
-        <w:spacing w:after="180" w:before="400"/>
-      </w:pPr>
-      <w:r>
-        <w:t xml:space="preserve">3. RAID: Redundant Array of Independent Disks</w:t>
-      </w:r>
-    </w:p>
-    <w:p>
-      <w:pPr>
-        <w:spacing w:after="180" w:line="300"/>
-        <w:jc w:val="both"/>
-      </w:pPr>
-      <w:r>
-        <w:rPr>
-          <w:sz w:val="22"/>
-          <w:szCs w:val="22"/>
-        </w:rPr>
-        <w:t xml:space="preserve">El RAID és un sistema que combina diversos discos o unitats SSD de manera distribuïda. En funció del nivell de RAID triat, s'obté:</w:t>
+          <w:b/>
+          <w:sz w:val="22"/>
+          <w:szCs w:val="22"/>
+        </w:rPr>
+        <w:t xml:space="preserve">Accessibilitat: </w:t>
+      </w:r>
+      <w:r>
+        <w:rPr>
+          <w:sz w:val="22"/>
+          <w:szCs w:val="22"/>
+        </w:rPr>
+        <w:t xml:space="preserve">que els usuaris puguin arribar a les dades quan les necessiten, de manera efectiva i segura: disc ben muntat, permisos correctes i sistema de fitxers sense errors. Un disc que funciona perfectament però està mal muntat no és accessible per a ningú.</w:t>
+      </w:r>
+    </w:p>
+    <w:p>
+      <w:pPr>
+        <w:pStyle w:val="Heading2"/>
+        <w:spacing w:after="140" w:before="260"/>
+      </w:pPr>
+      <w:r>
+        <w:rPr/>
+        <w:t xml:space="preserve">2.1. Com es mesura el rendiment</w:t>
       </w:r>
     </w:p>
     <w:p>
@@ -238,10 +251,18 @@
       </w:pPr>
       <w:r>
         <w:rPr>
-          <w:sz w:val="22"/>
-          <w:szCs w:val="22"/>
-        </w:rPr>
-        <w:t xml:space="preserve">Tolerància a fallades: si un disc falla, la informació no es perd.</w:t>
+          <w:b/>
+          <w:sz w:val="22"/>
+          <w:szCs w:val="22"/>
+        </w:rPr>
+        <w:t xml:space="preserve">Latència: </w:t>
+      </w:r>
+      <w:r>
+        <w:rPr>
+          <w:sz w:val="22"/>
+          <w:szCs w:val="22"/>
+        </w:rPr>
+        <w:t xml:space="preserve">temps que triga el disc a respondre una operació. Es mesura en mil·lisegons (ms) o microsegons (µs): com menys, millor.</w:t>
       </w:r>
     </w:p>
     <w:p>
@@ -255,10 +276,43 @@
       </w:pPr>
       <w:r>
         <w:rPr>
-          <w:sz w:val="22"/>
-          <w:szCs w:val="22"/>
-        </w:rPr>
-        <w:t xml:space="preserve">Millora del rendiment: la informació es distribueix entre diversos discos, de manera que es pot llegir i escriure en paral·lel.</w:t>
+          <w:b/>
+          <w:sz w:val="22"/>
+          <w:szCs w:val="22"/>
+        </w:rPr>
+        <w:t xml:space="preserve">IOPS (operacions d'entrada/sortida per segon): </w:t>
+      </w:r>
+      <w:r>
+        <w:rPr>
+          <w:sz w:val="22"/>
+          <w:szCs w:val="22"/>
+        </w:rPr>
+        <w:t xml:space="preserve">nombre d'operacions de lectura o escriptura que pot fer en un segon. És clau quan hi ha moltes peticions petites i aleatòries, com en un sistema operatiu o una base de dades.</w:t>
+      </w:r>
+    </w:p>
+    <w:p>
+      <w:pPr>
+        <w:pStyle w:val="ListParagraph"/>
+        <w:numPr>
+          <w:ilvl w:val="0"/>
+          <w:numId w:val="1"/>
+        </w:numPr>
+        <w:spacing w:after="100" w:line="280"/>
+      </w:pPr>
+      <w:r>
+        <w:rPr>
+          <w:b/>
+          <w:sz w:val="22"/>
+          <w:szCs w:val="22"/>
+        </w:rPr>
+        <w:t xml:space="preserve">Throughput (velocitat de transferència): </w:t>
+      </w:r>
+      <w:r>
+        <w:rPr>
+          <w:sz w:val="22"/>
+          <w:szCs w:val="22"/>
+        </w:rPr>
+        <w:t xml:space="preserve">quantitat de dades transferides per segon, en MB/s o GB/s. És clau amb fitxers grans i seqüencials, com un vídeo o una còpia de seguretat.</w:t>
       </w:r>
     </w:p>
     <w:p>
@@ -271,7 +325,7 @@
           <w:sz w:val="22"/>
           <w:szCs w:val="22"/>
         </w:rPr>
-        <w:t xml:space="preserve">Els sistemes RAID es poden implementar amb maquinari (controladores dedicades) o amb programari (el mateix sistema operatiu). La implementació per maquinari és més ràpida i sol permetre el hot swap (substituir un disc espatllat sense aturar el sistema), mentre que la implementació per programari és més barata però ofereix un rendiment inferior i només permet els nivells més bàsics de RAID.</w:t>
+        <w:t xml:space="preserve">Important: Un disc pot tenir un bon throughput i poques IOPS: copiar una pel·lícula (accés seqüencial) no costa el mateix que obrir milers de fitxers petits (accés aleatori). Per això un HDD pot copiar fitxers grans a una velocitat acceptable, però fa que l'arrencada del sistema operatiu sigui lenta.</w:t>
       </w:r>
     </w:p>
     <w:p>
@@ -280,7 +334,895 @@
         <w:spacing w:after="140" w:before="260"/>
       </w:pPr>
       <w:r>
-        <w:t xml:space="preserve">3.1. RAID 0 — Data striping</w:t>
+        <w:rPr/>
+        <w:t xml:space="preserve">2.2. HDD, SSD i NVMe en xifres</w:t>
+      </w:r>
+    </w:p>
+    <w:tbl>
+      <w:tblPr>
+        <w:tblW w:type="dxa" w:w="9000"/>
+        <w:tblBorders>
+          <w:top w:val="single" w:color="auto" w:sz="4"/>
+          <w:left w:val="single" w:color="auto" w:sz="4"/>
+          <w:bottom w:val="single" w:color="auto" w:sz="4"/>
+          <w:right w:val="single" w:color="auto" w:sz="4"/>
+          <w:insideH w:val="single" w:color="auto" w:sz="4"/>
+          <w:insideV w:val="single" w:color="auto" w:sz="4"/>
+        </w:tblBorders>
+      </w:tblPr>
+      <w:tblGrid>
+        <w:gridCol w:w="120"/>
+        <w:gridCol w:w="120"/>
+        <w:gridCol w:w="120"/>
+        <w:gridCol w:w="120"/>
+        <w:gridCol w:w="120"/>
+      </w:tblGrid>
+      <w:tr>
+        <w:trPr>
+          <w:cantSplit/>
+        </w:trPr>
+        <w:tc>
+          <w:tcPr>
+            <w:tcW w:type="dxa" w:w="120"/>
+            <w:shd w:fill="16242E" w:val="clear"/>
+          </w:tcPr>
+          <w:p>
+            <w:r>
+              <w:rPr>
+                <w:b/>
+                <w:bCs/>
+                <w:color w:val="FFFFFF"/>
+                <w:sz w:val="20"/>
+                <w:szCs w:val="20"/>
+              </w:rPr>
+              <w:t xml:space="preserve"/>
+            </w:r>
+          </w:p>
+        </w:tc>
+        <w:tc>
+          <w:tcPr>
+            <w:tcW w:type="dxa" w:w="120"/>
+            <w:shd w:fill="16242E" w:val="clear"/>
+          </w:tcPr>
+          <w:p>
+            <w:r>
+              <w:rPr>
+                <w:b/>
+                <w:bCs/>
+                <w:color w:val="FFFFFF"/>
+                <w:sz w:val="20"/>
+                <w:szCs w:val="20"/>
+              </w:rPr>
+              <w:t xml:space="preserve">HDD (7.200 rpm)</w:t>
+            </w:r>
+          </w:p>
+        </w:tc>
+        <w:tc>
+          <w:tcPr>
+            <w:tcW w:type="dxa" w:w="120"/>
+            <w:shd w:fill="16242E" w:val="clear"/>
+          </w:tcPr>
+          <w:p>
+            <w:r>
+              <w:rPr>
+                <w:b/>
+                <w:bCs/>
+                <w:color w:val="FFFFFF"/>
+                <w:sz w:val="20"/>
+                <w:szCs w:val="20"/>
+              </w:rPr>
+              <w:t xml:space="preserve">SSD SATA</w:t>
+            </w:r>
+          </w:p>
+        </w:tc>
+        <w:tc>
+          <w:tcPr>
+            <w:tcW w:type="dxa" w:w="120"/>
+            <w:shd w:fill="16242E" w:val="clear"/>
+          </w:tcPr>
+          <w:p>
+            <w:r>
+              <w:rPr>
+                <w:b/>
+                <w:bCs/>
+                <w:color w:val="FFFFFF"/>
+                <w:sz w:val="20"/>
+                <w:szCs w:val="20"/>
+              </w:rPr>
+              <w:t xml:space="preserve">SSD NVMe (M.2)</w:t>
+            </w:r>
+          </w:p>
+        </w:tc>
+        <w:tc>
+          <w:tcPr>
+            <w:tcW w:type="dxa" w:w="120"/>
+            <w:shd w:fill="16242E" w:val="clear"/>
+          </w:tcPr>
+          <w:p>
+            <w:r>
+              <w:rPr>
+                <w:b/>
+                <w:bCs/>
+                <w:color w:val="FFFFFF"/>
+                <w:sz w:val="20"/>
+                <w:szCs w:val="20"/>
+              </w:rPr>
+              <w:t xml:space="preserve">Llapis USB / SD</w:t>
+            </w:r>
+          </w:p>
+        </w:tc>
+      </w:tr>
+      <w:tr>
+        <w:trPr>
+          <w:cantSplit/>
+        </w:trPr>
+        <w:tc>
+          <w:tcPr>
+            <w:tcW w:type="dxa" w:w="120"/>
+            <w:shd w:fill="FFFFFF" w:val="clear"/>
+          </w:tcPr>
+          <w:p>
+            <w:r>
+              <w:rPr>
+                <w:b w:val="false"/>
+                <w:bCs w:val="false"/>
+                <w:color w:val="000000"/>
+                <w:sz w:val="20"/>
+                <w:szCs w:val="20"/>
+              </w:rPr>
+              <w:t xml:space="preserve">Latència</w:t>
+            </w:r>
+          </w:p>
+        </w:tc>
+        <w:tc>
+          <w:tcPr>
+            <w:tcW w:type="dxa" w:w="120"/>
+            <w:shd w:fill="FFFFFF" w:val="clear"/>
+          </w:tcPr>
+          <w:p>
+            <w:r>
+              <w:rPr>
+                <w:b w:val="false"/>
+                <w:bCs w:val="false"/>
+                <w:color w:val="000000"/>
+                <w:sz w:val="20"/>
+                <w:szCs w:val="20"/>
+              </w:rPr>
+              <w:t xml:space="preserve">5–10 ms</w:t>
+            </w:r>
+          </w:p>
+        </w:tc>
+        <w:tc>
+          <w:tcPr>
+            <w:tcW w:type="dxa" w:w="120"/>
+            <w:shd w:fill="FFFFFF" w:val="clear"/>
+          </w:tcPr>
+          <w:p>
+            <w:r>
+              <w:rPr>
+                <w:b w:val="false"/>
+                <w:bCs w:val="false"/>
+                <w:color w:val="000000"/>
+                <w:sz w:val="20"/>
+                <w:szCs w:val="20"/>
+              </w:rPr>
+              <w:t xml:space="preserve">≈ 0,1 ms</w:t>
+            </w:r>
+          </w:p>
+        </w:tc>
+        <w:tc>
+          <w:tcPr>
+            <w:tcW w:type="dxa" w:w="120"/>
+            <w:shd w:fill="FFFFFF" w:val="clear"/>
+          </w:tcPr>
+          <w:p>
+            <w:r>
+              <w:rPr>
+                <w:b w:val="false"/>
+                <w:bCs w:val="false"/>
+                <w:color w:val="000000"/>
+                <w:sz w:val="20"/>
+                <w:szCs w:val="20"/>
+              </w:rPr>
+              <w:t xml:space="preserve">≈ 0,02–0,1 ms</w:t>
+            </w:r>
+          </w:p>
+        </w:tc>
+        <w:tc>
+          <w:tcPr>
+            <w:tcW w:type="dxa" w:w="120"/>
+            <w:shd w:fill="FFFFFF" w:val="clear"/>
+          </w:tcPr>
+          <w:p>
+            <w:r>
+              <w:rPr>
+                <w:b w:val="false"/>
+                <w:bCs w:val="false"/>
+                <w:color w:val="000000"/>
+                <w:sz w:val="20"/>
+                <w:szCs w:val="20"/>
+              </w:rPr>
+              <w:t xml:space="preserve">Molt variable</w:t>
+            </w:r>
+          </w:p>
+        </w:tc>
+      </w:tr>
+      <w:tr>
+        <w:trPr>
+          <w:cantSplit/>
+        </w:trPr>
+        <w:tc>
+          <w:tcPr>
+            <w:tcW w:type="dxa" w:w="120"/>
+            <w:shd w:fill="FFFFFF" w:val="clear"/>
+          </w:tcPr>
+          <w:p>
+            <w:r>
+              <w:rPr>
+                <w:b w:val="false"/>
+                <w:bCs w:val="false"/>
+                <w:color w:val="000000"/>
+                <w:sz w:val="20"/>
+                <w:szCs w:val="20"/>
+              </w:rPr>
+              <w:t xml:space="preserve">IOPS (aleatòries)</w:t>
+            </w:r>
+          </w:p>
+        </w:tc>
+        <w:tc>
+          <w:tcPr>
+            <w:tcW w:type="dxa" w:w="120"/>
+            <w:shd w:fill="FFFFFF" w:val="clear"/>
+          </w:tcPr>
+          <w:p>
+            <w:r>
+              <w:rPr>
+                <w:b w:val="false"/>
+                <w:bCs w:val="false"/>
+                <w:color w:val="000000"/>
+                <w:sz w:val="20"/>
+                <w:szCs w:val="20"/>
+              </w:rPr>
+              <w:t xml:space="preserve">75–200</w:t>
+            </w:r>
+          </w:p>
+        </w:tc>
+        <w:tc>
+          <w:tcPr>
+            <w:tcW w:type="dxa" w:w="120"/>
+            <w:shd w:fill="FFFFFF" w:val="clear"/>
+          </w:tcPr>
+          <w:p>
+            <w:r>
+              <w:rPr>
+                <w:b w:val="false"/>
+                <w:bCs w:val="false"/>
+                <w:color w:val="000000"/>
+                <w:sz w:val="20"/>
+                <w:szCs w:val="20"/>
+              </w:rPr>
+              <w:t xml:space="preserve">Desenes de milers</w:t>
+            </w:r>
+          </w:p>
+        </w:tc>
+        <w:tc>
+          <w:tcPr>
+            <w:tcW w:type="dxa" w:w="120"/>
+            <w:shd w:fill="FFFFFF" w:val="clear"/>
+          </w:tcPr>
+          <w:p>
+            <w:r>
+              <w:rPr>
+                <w:b w:val="false"/>
+                <w:bCs w:val="false"/>
+                <w:color w:val="000000"/>
+                <w:sz w:val="20"/>
+                <w:szCs w:val="20"/>
+              </w:rPr>
+              <w:t xml:space="preserve">Centenars de milers</w:t>
+            </w:r>
+          </w:p>
+        </w:tc>
+        <w:tc>
+          <w:tcPr>
+            <w:tcW w:type="dxa" w:w="120"/>
+            <w:shd w:fill="FFFFFF" w:val="clear"/>
+          </w:tcPr>
+          <w:p>
+            <w:r>
+              <w:rPr>
+                <w:b w:val="false"/>
+                <w:bCs w:val="false"/>
+                <w:color w:val="000000"/>
+                <w:sz w:val="20"/>
+                <w:szCs w:val="20"/>
+              </w:rPr>
+              <w:t xml:space="preserve">Centenars o pocs milers</w:t>
+            </w:r>
+          </w:p>
+        </w:tc>
+      </w:tr>
+      <w:tr>
+        <w:trPr>
+          <w:cantSplit/>
+        </w:trPr>
+        <w:tc>
+          <w:tcPr>
+            <w:tcW w:type="dxa" w:w="120"/>
+            <w:shd w:fill="FFFFFF" w:val="clear"/>
+          </w:tcPr>
+          <w:p>
+            <w:r>
+              <w:rPr>
+                <w:b w:val="false"/>
+                <w:bCs w:val="false"/>
+                <w:color w:val="000000"/>
+                <w:sz w:val="20"/>
+                <w:szCs w:val="20"/>
+              </w:rPr>
+              <w:t xml:space="preserve">Throughput</w:t>
+            </w:r>
+          </w:p>
+        </w:tc>
+        <w:tc>
+          <w:tcPr>
+            <w:tcW w:type="dxa" w:w="120"/>
+            <w:shd w:fill="FFFFFF" w:val="clear"/>
+          </w:tcPr>
+          <w:p>
+            <w:r>
+              <w:rPr>
+                <w:b w:val="false"/>
+                <w:bCs w:val="false"/>
+                <w:color w:val="000000"/>
+                <w:sz w:val="20"/>
+                <w:szCs w:val="20"/>
+              </w:rPr>
+              <w:t xml:space="preserve">100–250 MB/s</w:t>
+            </w:r>
+          </w:p>
+        </w:tc>
+        <w:tc>
+          <w:tcPr>
+            <w:tcW w:type="dxa" w:w="120"/>
+            <w:shd w:fill="FFFFFF" w:val="clear"/>
+          </w:tcPr>
+          <w:p>
+            <w:r>
+              <w:rPr>
+                <w:b w:val="false"/>
+                <w:bCs w:val="false"/>
+                <w:color w:val="000000"/>
+                <w:sz w:val="20"/>
+                <w:szCs w:val="20"/>
+              </w:rPr>
+              <w:t xml:space="preserve">Fins a ≈ 550 MB/s</w:t>
+            </w:r>
+          </w:p>
+        </w:tc>
+        <w:tc>
+          <w:tcPr>
+            <w:tcW w:type="dxa" w:w="120"/>
+            <w:shd w:fill="FFFFFF" w:val="clear"/>
+          </w:tcPr>
+          <w:p>
+            <w:r>
+              <w:rPr>
+                <w:b w:val="false"/>
+                <w:bCs w:val="false"/>
+                <w:color w:val="000000"/>
+                <w:sz w:val="20"/>
+                <w:szCs w:val="20"/>
+              </w:rPr>
+              <w:t xml:space="preserve">3.000–14.000 MB/s</w:t>
+            </w:r>
+          </w:p>
+        </w:tc>
+        <w:tc>
+          <w:tcPr>
+            <w:tcW w:type="dxa" w:w="120"/>
+            <w:shd w:fill="FFFFFF" w:val="clear"/>
+          </w:tcPr>
+          <w:p>
+            <w:r>
+              <w:rPr>
+                <w:b w:val="false"/>
+                <w:bCs w:val="false"/>
+                <w:color w:val="000000"/>
+                <w:sz w:val="20"/>
+                <w:szCs w:val="20"/>
+              </w:rPr>
+              <w:t xml:space="preserve">20–400 MB/s</w:t>
+            </w:r>
+          </w:p>
+        </w:tc>
+      </w:tr>
+      <w:tr>
+        <w:trPr>
+          <w:cantSplit/>
+        </w:trPr>
+        <w:tc>
+          <w:tcPr>
+            <w:tcW w:type="dxa" w:w="120"/>
+            <w:shd w:fill="FFFFFF" w:val="clear"/>
+          </w:tcPr>
+          <w:p>
+            <w:r>
+              <w:rPr>
+                <w:b w:val="false"/>
+                <w:bCs w:val="false"/>
+                <w:color w:val="000000"/>
+                <w:sz w:val="20"/>
+                <w:szCs w:val="20"/>
+              </w:rPr>
+              <w:t xml:space="preserve">Connexió</w:t>
+            </w:r>
+          </w:p>
+        </w:tc>
+        <w:tc>
+          <w:tcPr>
+            <w:tcW w:type="dxa" w:w="120"/>
+            <w:shd w:fill="FFFFFF" w:val="clear"/>
+          </w:tcPr>
+          <w:p>
+            <w:r>
+              <w:rPr>
+                <w:b w:val="false"/>
+                <w:bCs w:val="false"/>
+                <w:color w:val="000000"/>
+                <w:sz w:val="20"/>
+                <w:szCs w:val="20"/>
+              </w:rPr>
+              <w:t xml:space="preserve">SATA</w:t>
+            </w:r>
+          </w:p>
+        </w:tc>
+        <w:tc>
+          <w:tcPr>
+            <w:tcW w:type="dxa" w:w="120"/>
+            <w:shd w:fill="FFFFFF" w:val="clear"/>
+          </w:tcPr>
+          <w:p>
+            <w:r>
+              <w:rPr>
+                <w:b w:val="false"/>
+                <w:bCs w:val="false"/>
+                <w:color w:val="000000"/>
+                <w:sz w:val="20"/>
+                <w:szCs w:val="20"/>
+              </w:rPr>
+              <w:t xml:space="preserve">SATA</w:t>
+            </w:r>
+          </w:p>
+        </w:tc>
+        <w:tc>
+          <w:tcPr>
+            <w:tcW w:type="dxa" w:w="120"/>
+            <w:shd w:fill="FFFFFF" w:val="clear"/>
+          </w:tcPr>
+          <w:p>
+            <w:r>
+              <w:rPr>
+                <w:b w:val="false"/>
+                <w:bCs w:val="false"/>
+                <w:color w:val="000000"/>
+                <w:sz w:val="20"/>
+                <w:szCs w:val="20"/>
+              </w:rPr>
+              <w:t xml:space="preserve">PCIe</w:t>
+            </w:r>
+          </w:p>
+        </w:tc>
+        <w:tc>
+          <w:tcPr>
+            <w:tcW w:type="dxa" w:w="120"/>
+            <w:shd w:fill="FFFFFF" w:val="clear"/>
+          </w:tcPr>
+          <w:p>
+            <w:r>
+              <w:rPr>
+                <w:b w:val="false"/>
+                <w:bCs w:val="false"/>
+                <w:color w:val="000000"/>
+                <w:sz w:val="20"/>
+                <w:szCs w:val="20"/>
+              </w:rPr>
+              <w:t xml:space="preserve">USB o lector de targetes</w:t>
+            </w:r>
+          </w:p>
+        </w:tc>
+      </w:tr>
+      <w:tr>
+        <w:trPr>
+          <w:cantSplit/>
+        </w:trPr>
+        <w:tc>
+          <w:tcPr>
+            <w:tcW w:type="dxa" w:w="120"/>
+            <w:shd w:fill="FFFFFF" w:val="clear"/>
+          </w:tcPr>
+          <w:p>
+            <w:r>
+              <w:rPr>
+                <w:b w:val="false"/>
+                <w:bCs w:val="false"/>
+                <w:color w:val="000000"/>
+                <w:sz w:val="20"/>
+                <w:szCs w:val="20"/>
+              </w:rPr>
+              <w:t xml:space="preserve">Cost per GB</w:t>
+            </w:r>
+          </w:p>
+        </w:tc>
+        <w:tc>
+          <w:tcPr>
+            <w:tcW w:type="dxa" w:w="120"/>
+            <w:shd w:fill="FFFFFF" w:val="clear"/>
+          </w:tcPr>
+          <w:p>
+            <w:r>
+              <w:rPr>
+                <w:b w:val="false"/>
+                <w:bCs w:val="false"/>
+                <w:color w:val="000000"/>
+                <w:sz w:val="20"/>
+                <w:szCs w:val="20"/>
+              </w:rPr>
+              <w:t xml:space="preserve">El més baix</w:t>
+            </w:r>
+          </w:p>
+        </w:tc>
+        <w:tc>
+          <w:tcPr>
+            <w:tcW w:type="dxa" w:w="120"/>
+            <w:shd w:fill="FFFFFF" w:val="clear"/>
+          </w:tcPr>
+          <w:p>
+            <w:r>
+              <w:rPr>
+                <w:b w:val="false"/>
+                <w:bCs w:val="false"/>
+                <w:color w:val="000000"/>
+                <w:sz w:val="20"/>
+                <w:szCs w:val="20"/>
+              </w:rPr>
+              <w:t xml:space="preserve">Mitjà</w:t>
+            </w:r>
+          </w:p>
+        </w:tc>
+        <w:tc>
+          <w:tcPr>
+            <w:tcW w:type="dxa" w:w="120"/>
+            <w:shd w:fill="FFFFFF" w:val="clear"/>
+          </w:tcPr>
+          <w:p>
+            <w:r>
+              <w:rPr>
+                <w:b w:val="false"/>
+                <w:bCs w:val="false"/>
+                <w:color w:val="000000"/>
+                <w:sz w:val="20"/>
+                <w:szCs w:val="20"/>
+              </w:rPr>
+              <w:t xml:space="preserve">Mitjà-alt</w:t>
+            </w:r>
+          </w:p>
+        </w:tc>
+        <w:tc>
+          <w:tcPr>
+            <w:tcW w:type="dxa" w:w="120"/>
+            <w:shd w:fill="FFFFFF" w:val="clear"/>
+          </w:tcPr>
+          <w:p>
+            <w:r>
+              <w:rPr>
+                <w:b w:val="false"/>
+                <w:bCs w:val="false"/>
+                <w:color w:val="000000"/>
+                <w:sz w:val="20"/>
+                <w:szCs w:val="20"/>
+              </w:rPr>
+              <w:t xml:space="preserve">Variable</w:t>
+            </w:r>
+          </w:p>
+        </w:tc>
+      </w:tr>
+      <w:tr>
+        <w:trPr>
+          <w:cantSplit/>
+        </w:trPr>
+        <w:tc>
+          <w:tcPr>
+            <w:tcW w:type="dxa" w:w="120"/>
+            <w:shd w:fill="FFFFFF" w:val="clear"/>
+          </w:tcPr>
+          <w:p>
+            <w:r>
+              <w:rPr>
+                <w:b w:val="false"/>
+                <w:bCs w:val="false"/>
+                <w:color w:val="000000"/>
+                <w:sz w:val="20"/>
+                <w:szCs w:val="20"/>
+              </w:rPr>
+              <w:t xml:space="preserve">Ús típic</w:t>
+            </w:r>
+          </w:p>
+        </w:tc>
+        <w:tc>
+          <w:tcPr>
+            <w:tcW w:type="dxa" w:w="120"/>
+            <w:shd w:fill="FFFFFF" w:val="clear"/>
+          </w:tcPr>
+          <w:p>
+            <w:r>
+              <w:rPr>
+                <w:b w:val="false"/>
+                <w:bCs w:val="false"/>
+                <w:color w:val="000000"/>
+                <w:sz w:val="20"/>
+                <w:szCs w:val="20"/>
+              </w:rPr>
+              <w:t xml:space="preserve">Gran capacitat, arxiu i còpies</w:t>
+            </w:r>
+          </w:p>
+        </w:tc>
+        <w:tc>
+          <w:tcPr>
+            <w:tcW w:type="dxa" w:w="120"/>
+            <w:shd w:fill="FFFFFF" w:val="clear"/>
+          </w:tcPr>
+          <w:p>
+            <w:r>
+              <w:rPr>
+                <w:b w:val="false"/>
+                <w:bCs w:val="false"/>
+                <w:color w:val="000000"/>
+                <w:sz w:val="20"/>
+                <w:szCs w:val="20"/>
+              </w:rPr>
+              <w:t xml:space="preserve">Equips d'oficina</w:t>
+            </w:r>
+          </w:p>
+        </w:tc>
+        <w:tc>
+          <w:tcPr>
+            <w:tcW w:type="dxa" w:w="120"/>
+            <w:shd w:fill="FFFFFF" w:val="clear"/>
+          </w:tcPr>
+          <w:p>
+            <w:r>
+              <w:rPr>
+                <w:b w:val="false"/>
+                <w:bCs w:val="false"/>
+                <w:color w:val="000000"/>
+                <w:sz w:val="20"/>
+                <w:szCs w:val="20"/>
+              </w:rPr>
+              <w:t xml:space="preserve">Servidors i equips exigents</w:t>
+            </w:r>
+          </w:p>
+        </w:tc>
+        <w:tc>
+          <w:tcPr>
+            <w:tcW w:type="dxa" w:w="120"/>
+            <w:shd w:fill="FFFFFF" w:val="clear"/>
+          </w:tcPr>
+          <w:p>
+            <w:r>
+              <w:rPr>
+                <w:b w:val="false"/>
+                <w:bCs w:val="false"/>
+                <w:color w:val="000000"/>
+                <w:sz w:val="20"/>
+                <w:szCs w:val="20"/>
+              </w:rPr>
+              <w:t xml:space="preserve">Transport de dades</w:t>
+            </w:r>
+          </w:p>
+        </w:tc>
+      </w:tr>
+    </w:tbl>
+    <w:p>
+      <w:pPr>
+        <w:spacing w:after="180" w:line="300"/>
+        <w:jc w:val="both"/>
+      </w:pPr>
+      <w:r>
+        <w:rPr>
+          <w:i/>
+          <w:iCs/>
+          <w:sz w:val="18"/>
+          <w:szCs w:val="18"/>
+        </w:rPr>
+        <w:t xml:space="preserve">Valors orientatius (ordre de magnitud): cada model concret pot variar. Els SSD SATA estan limitats per la connexió SATA (≈ 600 MB/s); els NVMe es connecten directament al bus PCIe i per això són molt més ràpids.</w:t>
+      </w:r>
+    </w:p>
+    <w:p>
+      <w:pPr>
+        <w:pStyle w:val="Heading2"/>
+        <w:spacing w:after="140" w:before="260"/>
+      </w:pPr>
+      <w:r>
+        <w:rPr/>
+        <w:t xml:space="preserve">2.3. Detectar anomalies: SMART</w:t>
+      </w:r>
+    </w:p>
+    <w:p>
+      <w:pPr>
+        <w:spacing w:after="180" w:line="300"/>
+        <w:jc w:val="both"/>
+      </w:pPr>
+      <w:r>
+        <w:rPr>
+          <w:sz w:val="22"/>
+          <w:szCs w:val="22"/>
+        </w:rPr>
+        <w:t xml:space="preserve">SMART (Self-Monitoring, Analysis and Reporting Technology) és un sistema integrat als discos HDD, SSD i NVMe que registra indicadors de salut del disc: sectors defectuosos reassignats, errors de lectura, temperatura, hores d'ús o, en els SSD, el desgast de les cel·les. Si aquests valors empitjoren, cal substituir el disc ABANS que falli i es perdin dades.</w:t>
+      </w:r>
+    </w:p>
+    <w:p>
+      <w:pPr>
+        <w:spacing w:after="180" w:line="300"/>
+        <w:jc w:val="both"/>
+      </w:pPr>
+      <w:r>
+        <w:rPr>
+          <w:sz w:val="22"/>
+          <w:szCs w:val="22"/>
+        </w:rPr>
+        <w:t xml:space="preserve">A Ubuntu es pot consultar amb l'eina smartctl (cal instal·lar el paquet smartmontools): sudo smartctl -H /dev/sda mostra l'estat de salut general del disc i sudo smartctl -a /dev/sda en mostra tots els indicadors. A l'escriptori, l'aplicació Discos també mostra les dades SMART de cada disc.</w:t>
+      </w:r>
+    </w:p>
+    <w:p>
+      <w:pPr>
+        <w:pStyle w:val="Heading1"/>
+        <w:spacing w:after="180" w:before="400"/>
+      </w:pPr>
+      <w:r>
+        <w:t xml:space="preserve">3. La redundància: no dependre mai d'un sol disc</w:t>
+      </w:r>
+    </w:p>
+    <w:p>
+      <w:pPr>
+        <w:spacing w:after="180" w:line="300"/>
+        <w:jc w:val="both"/>
+      </w:pPr>
+      <w:r>
+        <w:rPr>
+          <w:sz w:val="22"/>
+          <w:szCs w:val="22"/>
+        </w:rPr>
+        <w:t xml:space="preserve">Duplicar la informació permet evitar-ne la pèrdua davant l'avaria d'un disc. Aquesta duplicació es pot implementar amb diverses tècniques, que sovint es combinen entre elles per evitar un únic punt de fallada (single point of failure):</w:t>
+      </w:r>
+    </w:p>
+    <w:p>
+      <w:pPr>
+        <w:pStyle w:val="ListParagraph"/>
+        <w:numPr>
+          <w:ilvl w:val="0"/>
+          <w:numId w:val="1"/>
+        </w:numPr>
+        <w:spacing w:after="100" w:line="280"/>
+      </w:pPr>
+      <w:r>
+        <w:rPr>
+          <w:sz w:val="22"/>
+          <w:szCs w:val="22"/>
+        </w:rPr>
+        <w:t xml:space="preserve">RAID (Redundant Array of Independent Disks): combina diverses unitats d'emmagatzematge en una sola unitat lògica. És redundància LOCAL, dins del mateix equip.</w:t>
+      </w:r>
+    </w:p>
+    <w:p>
+      <w:pPr>
+        <w:pStyle w:val="ListParagraph"/>
+        <w:numPr>
+          <w:ilvl w:val="0"/>
+          <w:numId w:val="1"/>
+        </w:numPr>
+        <w:spacing w:after="100" w:line="280"/>
+      </w:pPr>
+      <w:r>
+        <w:rPr>
+          <w:sz w:val="22"/>
+          <w:szCs w:val="22"/>
+        </w:rPr>
+        <w:t xml:space="preserve">Sistemes d'emmagatzematge en xarxa: proporcionen redundància a nivell de xarxa local (més d'un servidor o cabina de discos). Internament, aquests sistemes ja fan servir RAID.</w:t>
+      </w:r>
+    </w:p>
+    <w:p>
+      <w:pPr>
+        <w:pStyle w:val="ListParagraph"/>
+        <w:numPr>
+          <w:ilvl w:val="0"/>
+          <w:numId w:val="1"/>
+        </w:numPr>
+        <w:spacing w:after="100" w:line="280"/>
+      </w:pPr>
+      <w:r>
+        <w:rPr>
+          <w:sz w:val="22"/>
+          <w:szCs w:val="22"/>
+        </w:rPr>
+        <w:t xml:space="preserve">Serveis de núvol: com Dropbox, Google Drive o OneDrive, que mantenen la informació "duplicada" a Internet. Són molt atractius per a l'ús domèstic, però cal valorar-ne els aspectes legals, de privacitat i de velocitat de sincronització.</w:t>
+      </w:r>
+    </w:p>
+    <w:p>
+      <w:pPr>
+        <w:pStyle w:val="Heading1"/>
+        <w:spacing w:after="180" w:before="400"/>
+      </w:pPr>
+      <w:r>
+        <w:t xml:space="preserve">4. RAID: Redundant Array of Independent Disks</w:t>
+      </w:r>
+    </w:p>
+    <w:p>
+      <w:pPr>
+        <w:spacing w:after="180" w:line="300"/>
+        <w:jc w:val="both"/>
+      </w:pPr>
+      <w:r>
+        <w:rPr>
+          <w:sz w:val="22"/>
+          <w:szCs w:val="22"/>
+        </w:rPr>
+        <w:t xml:space="preserve">El RAID és un sistema que combina diversos discos o unitats SSD de manera distribuïda. En funció del nivell de RAID triat, s'obté:</w:t>
+      </w:r>
+    </w:p>
+    <w:p>
+      <w:pPr>
+        <w:pStyle w:val="ListParagraph"/>
+        <w:numPr>
+          <w:ilvl w:val="0"/>
+          <w:numId w:val="1"/>
+        </w:numPr>
+        <w:spacing w:after="100" w:line="280"/>
+      </w:pPr>
+      <w:r>
+        <w:rPr>
+          <w:sz w:val="22"/>
+          <w:szCs w:val="22"/>
+        </w:rPr>
+        <w:t xml:space="preserve">Tolerància a fallades: si un disc falla, la informació no es perd.</w:t>
+      </w:r>
+    </w:p>
+    <w:p>
+      <w:pPr>
+        <w:pStyle w:val="ListParagraph"/>
+        <w:numPr>
+          <w:ilvl w:val="0"/>
+          <w:numId w:val="1"/>
+        </w:numPr>
+        <w:spacing w:after="100" w:line="280"/>
+      </w:pPr>
+      <w:r>
+        <w:rPr>
+          <w:sz w:val="22"/>
+          <w:szCs w:val="22"/>
+        </w:rPr>
+        <w:t xml:space="preserve">Millora del rendiment: la informació es distribueix entre diversos discos, de manera que es pot llegir i escriure en paral·lel.</w:t>
+      </w:r>
+    </w:p>
+    <w:p>
+      <w:pPr>
+        <w:spacing w:after="180" w:line="300"/>
+        <w:jc w:val="both"/>
+      </w:pPr>
+      <w:r>
+        <w:rPr>
+          <w:sz w:val="22"/>
+          <w:szCs w:val="22"/>
+        </w:rPr>
+        <w:t xml:space="preserve">Els sistemes RAID es poden implementar amb maquinari (controladores dedicades) o amb programari (el mateix sistema operatiu). La implementació per maquinari és més ràpida i sol permetre el hot swap (substituir un disc espatllat sense aturar el sistema), mentre que la implementació per programari és més barata però ofereix un rendiment inferior i només permet els nivells més bàsics de RAID.</w:t>
+      </w:r>
+    </w:p>
+    <w:p>
+      <w:pPr>
+        <w:pStyle w:val="Heading2"/>
+        <w:spacing w:after="140" w:before="260"/>
+      </w:pPr>
+      <w:r>
+        <w:t xml:space="preserve">4.1. RAID 0 — Data striping</w:t>
       </w:r>
     </w:p>
     <w:p>
@@ -354,7 +1296,7 @@
         <w:spacing w:after="140" w:before="260"/>
       </w:pPr>
       <w:r>
-        <w:t xml:space="preserve">3.2. RAID 1 — Mirror</w:t>
+        <w:t xml:space="preserve">4.2. RAID 1 — Mirror</w:t>
       </w:r>
     </w:p>
     <w:p>
@@ -428,7 +1370,7 @@
         <w:spacing w:after="140" w:before="260"/>
       </w:pPr>
       <w:r>
-        <w:t xml:space="preserve">3.3. RAID 5 — Paritat distribuïda</w:t>
+        <w:t xml:space="preserve">4.3. RAID 5 — Paritat distribuïda</w:t>
       </w:r>
     </w:p>
     <w:p>
@@ -502,7 +1444,7 @@
         <w:spacing w:after="140" w:before="260"/>
       </w:pPr>
       <w:r>
-        <w:t xml:space="preserve">3.4. RAID 6 — Doble paritat</w:t>
+        <w:t xml:space="preserve">4.4. RAID 6 — Doble paritat</w:t>
       </w:r>
     </w:p>
     <w:p>
@@ -576,7 +1518,7 @@
         <w:spacing w:after="140" w:before="260"/>
       </w:pPr>
       <w:r>
-        <w:t xml:space="preserve">3.5. RAID aniuat (RAID 10)</w:t>
+        <w:t xml:space="preserve">4.5. RAID aniuat (RAID 10)</w:t>
       </w:r>
     </w:p>
     <w:p>
@@ -726,7 +1668,7 @@
         <w:spacing w:after="140" w:before="260"/>
       </w:pPr>
       <w:r>
-        <w:t xml:space="preserve">3.6. Comparativa de nivells de RAID</w:t>
+        <w:t xml:space="preserve">4.6. Comparativa de nivells de RAID</w:t>
       </w:r>
     </w:p>
     <w:tbl>
@@ -1589,7 +2531,7 @@
         <w:spacing w:after="180" w:before="400"/>
       </w:pPr>
       <w:r>
-        <w:t xml:space="preserve">4. Sistemes d'emmagatzematge en xarxa</w:t>
+        <w:t xml:space="preserve">5. Sistemes d'emmagatzematge en xarxa</w:t>
       </w:r>
     </w:p>
     <w:p>
@@ -1624,7 +2566,7 @@
         <w:spacing w:after="140" w:before="260"/>
       </w:pPr>
       <w:r>
-        <w:t xml:space="preserve">4.1. DAS (Direct Attached Storage)</w:t>
+        <w:t xml:space="preserve">5.1. DAS (Direct Attached Storage)</w:t>
       </w:r>
     </w:p>
     <w:p>
@@ -1774,7 +2716,7 @@
         <w:spacing w:after="140" w:before="260"/>
       </w:pPr>
       <w:r>
-        <w:t xml:space="preserve">4.2. NAS (Network Attached Storage)</w:t>
+        <w:t xml:space="preserve">5.2. NAS (Network Attached Storage)</w:t>
       </w:r>
     </w:p>
     <w:p>
@@ -1848,7 +2790,7 @@
         <w:spacing w:after="140" w:before="260"/>
       </w:pPr>
       <w:r>
-        <w:t xml:space="preserve">4.3. SAN (Storage Area Network)</w:t>
+        <w:t xml:space="preserve">5.3. SAN (Storage Area Network)</w:t>
       </w:r>
     </w:p>
     <w:p>
@@ -1992,7 +2934,7 @@
         <w:spacing w:after="180" w:before="400"/>
       </w:pPr>
       <w:r>
-        <w:t xml:space="preserve">5. Serveis de núvol</w:t>
+        <w:t xml:space="preserve">6. Serveis de núvol</w:t>
       </w:r>
     </w:p>
     <w:p>
@@ -2019,6 +2961,485 @@
           <w:szCs w:val="22"/>
         </w:rPr>
         <w:t xml:space="preserve">Cal tenir en compte, però, alguns riscos: la sincronització pot ser lenta amb fitxers grans; es perd el control complet sobre les dades (seguretat, continuïtat del servei si el proveïdor tanca o canvia les condicions); i cal complir la normativa legal aplicable (com el RGPD a Europa) quan les dades emmagatzemades incloguin informació de caràcter personal.</w:t>
+      </w:r>
+    </w:p>
+    <w:p>
+      <w:pPr>
+        <w:pStyle w:val="Heading2"/>
+        <w:spacing w:after="140" w:before="260"/>
+      </w:pPr>
+      <w:r>
+        <w:rPr/>
+        <w:t xml:space="preserve">6.1. Local o núvol?</w:t>
+      </w:r>
+    </w:p>
+    <w:tbl>
+      <w:tblPr>
+        <w:tblW w:type="dxa" w:w="9000"/>
+        <w:tblBorders>
+          <w:top w:val="single" w:color="auto" w:sz="4"/>
+          <w:left w:val="single" w:color="auto" w:sz="4"/>
+          <w:bottom w:val="single" w:color="auto" w:sz="4"/>
+          <w:right w:val="single" w:color="auto" w:sz="4"/>
+          <w:insideH w:val="single" w:color="auto" w:sz="4"/>
+          <w:insideV w:val="single" w:color="auto" w:sz="4"/>
+        </w:tblBorders>
+      </w:tblPr>
+      <w:tblGrid>
+        <w:gridCol w:w="120"/>
+        <w:gridCol w:w="240"/>
+        <w:gridCol w:w="240"/>
+      </w:tblGrid>
+      <w:tr>
+        <w:trPr>
+          <w:cantSplit/>
+        </w:trPr>
+        <w:tc>
+          <w:tcPr>
+            <w:tcW w:type="dxa" w:w="120"/>
+            <w:shd w:fill="16242E" w:val="clear"/>
+          </w:tcPr>
+          <w:p>
+            <w:r>
+              <w:rPr>
+                <w:b/>
+                <w:bCs/>
+                <w:color w:val="FFFFFF"/>
+                <w:sz w:val="20"/>
+                <w:szCs w:val="20"/>
+              </w:rPr>
+              <w:t xml:space="preserve"/>
+            </w:r>
+          </w:p>
+        </w:tc>
+        <w:tc>
+          <w:tcPr>
+            <w:tcW w:type="dxa" w:w="240"/>
+            <w:shd w:fill="16242E" w:val="clear"/>
+          </w:tcPr>
+          <w:p>
+            <w:r>
+              <w:rPr>
+                <w:b/>
+                <w:bCs/>
+                <w:color w:val="FFFFFF"/>
+                <w:sz w:val="20"/>
+                <w:szCs w:val="20"/>
+              </w:rPr>
+              <w:t xml:space="preserve">Local (on-premise)</w:t>
+            </w:r>
+          </w:p>
+        </w:tc>
+        <w:tc>
+          <w:tcPr>
+            <w:tcW w:type="dxa" w:w="240"/>
+            <w:shd w:fill="16242E" w:val="clear"/>
+          </w:tcPr>
+          <w:p>
+            <w:r>
+              <w:rPr>
+                <w:b/>
+                <w:bCs/>
+                <w:color w:val="FFFFFF"/>
+                <w:sz w:val="20"/>
+                <w:szCs w:val="20"/>
+              </w:rPr>
+              <w:t xml:space="preserve">Núvol</w:t>
+            </w:r>
+          </w:p>
+        </w:tc>
+      </w:tr>
+      <w:tr>
+        <w:trPr>
+          <w:cantSplit/>
+        </w:trPr>
+        <w:tc>
+          <w:tcPr>
+            <w:tcW w:type="dxa" w:w="120"/>
+            <w:shd w:fill="FFFFFF" w:val="clear"/>
+          </w:tcPr>
+          <w:p>
+            <w:r>
+              <w:rPr>
+                <w:b w:val="false"/>
+                <w:bCs w:val="false"/>
+                <w:color w:val="000000"/>
+                <w:sz w:val="20"/>
+                <w:szCs w:val="20"/>
+              </w:rPr>
+              <w:t xml:space="preserve">Cost</w:t>
+            </w:r>
+          </w:p>
+        </w:tc>
+        <w:tc>
+          <w:tcPr>
+            <w:tcW w:type="dxa" w:w="240"/>
+            <w:shd w:fill="FFFFFF" w:val="clear"/>
+          </w:tcPr>
+          <w:p>
+            <w:r>
+              <w:rPr>
+                <w:b w:val="false"/>
+                <w:bCs w:val="false"/>
+                <w:color w:val="000000"/>
+                <w:sz w:val="20"/>
+                <w:szCs w:val="20"/>
+              </w:rPr>
+              <w:t xml:space="preserve">Inversió inicial alta + manteniment</w:t>
+            </w:r>
+          </w:p>
+        </w:tc>
+        <w:tc>
+          <w:tcPr>
+            <w:tcW w:type="dxa" w:w="240"/>
+            <w:shd w:fill="FFFFFF" w:val="clear"/>
+          </w:tcPr>
+          <w:p>
+            <w:r>
+              <w:rPr>
+                <w:b w:val="false"/>
+                <w:bCs w:val="false"/>
+                <w:color w:val="000000"/>
+                <w:sz w:val="20"/>
+                <w:szCs w:val="20"/>
+              </w:rPr>
+              <w:t xml:space="preserve">Pagament per ús</w:t>
+            </w:r>
+          </w:p>
+        </w:tc>
+      </w:tr>
+      <w:tr>
+        <w:trPr>
+          <w:cantSplit/>
+        </w:trPr>
+        <w:tc>
+          <w:tcPr>
+            <w:tcW w:type="dxa" w:w="120"/>
+            <w:shd w:fill="FFFFFF" w:val="clear"/>
+          </w:tcPr>
+          <w:p>
+            <w:r>
+              <w:rPr>
+                <w:b w:val="false"/>
+                <w:bCs w:val="false"/>
+                <w:color w:val="000000"/>
+                <w:sz w:val="20"/>
+                <w:szCs w:val="20"/>
+              </w:rPr>
+              <w:t xml:space="preserve">Escalabilitat</w:t>
+            </w:r>
+          </w:p>
+        </w:tc>
+        <w:tc>
+          <w:tcPr>
+            <w:tcW w:type="dxa" w:w="240"/>
+            <w:shd w:fill="FFFFFF" w:val="clear"/>
+          </w:tcPr>
+          <w:p>
+            <w:r>
+              <w:rPr>
+                <w:b w:val="false"/>
+                <w:bCs w:val="false"/>
+                <w:color w:val="000000"/>
+                <w:sz w:val="20"/>
+                <w:szCs w:val="20"/>
+              </w:rPr>
+              <w:t xml:space="preserve">Limitada al maquinari propi</w:t>
+            </w:r>
+          </w:p>
+        </w:tc>
+        <w:tc>
+          <w:tcPr>
+            <w:tcW w:type="dxa" w:w="240"/>
+            <w:shd w:fill="FFFFFF" w:val="clear"/>
+          </w:tcPr>
+          <w:p>
+            <w:r>
+              <w:rPr>
+                <w:b w:val="false"/>
+                <w:bCs w:val="false"/>
+                <w:color w:val="000000"/>
+                <w:sz w:val="20"/>
+                <w:szCs w:val="20"/>
+              </w:rPr>
+              <w:t xml:space="preserve">Pràcticament il·limitada</w:t>
+            </w:r>
+          </w:p>
+        </w:tc>
+      </w:tr>
+      <w:tr>
+        <w:trPr>
+          <w:cantSplit/>
+        </w:trPr>
+        <w:tc>
+          <w:tcPr>
+            <w:tcW w:type="dxa" w:w="120"/>
+            <w:shd w:fill="FFFFFF" w:val="clear"/>
+          </w:tcPr>
+          <w:p>
+            <w:r>
+              <w:rPr>
+                <w:b w:val="false"/>
+                <w:bCs w:val="false"/>
+                <w:color w:val="000000"/>
+                <w:sz w:val="20"/>
+                <w:szCs w:val="20"/>
+              </w:rPr>
+              <w:t xml:space="preserve">Accés</w:t>
+            </w:r>
+          </w:p>
+        </w:tc>
+        <w:tc>
+          <w:tcPr>
+            <w:tcW w:type="dxa" w:w="240"/>
+            <w:shd w:fill="FFFFFF" w:val="clear"/>
+          </w:tcPr>
+          <w:p>
+            <w:r>
+              <w:rPr>
+                <w:b w:val="false"/>
+                <w:bCs w:val="false"/>
+                <w:color w:val="000000"/>
+                <w:sz w:val="20"/>
+                <w:szCs w:val="20"/>
+              </w:rPr>
+              <w:t xml:space="preserve">Xarxa local o VPN</w:t>
+            </w:r>
+          </w:p>
+        </w:tc>
+        <w:tc>
+          <w:tcPr>
+            <w:tcW w:type="dxa" w:w="240"/>
+            <w:shd w:fill="FFFFFF" w:val="clear"/>
+          </w:tcPr>
+          <w:p>
+            <w:r>
+              <w:rPr>
+                <w:b w:val="false"/>
+                <w:bCs w:val="false"/>
+                <w:color w:val="000000"/>
+                <w:sz w:val="20"/>
+                <w:szCs w:val="20"/>
+              </w:rPr>
+              <w:t xml:space="preserve">Des de qualsevol lloc amb Internet</w:t>
+            </w:r>
+          </w:p>
+        </w:tc>
+      </w:tr>
+      <w:tr>
+        <w:trPr>
+          <w:cantSplit/>
+        </w:trPr>
+        <w:tc>
+          <w:tcPr>
+            <w:tcW w:type="dxa" w:w="120"/>
+            <w:shd w:fill="FFFFFF" w:val="clear"/>
+          </w:tcPr>
+          <w:p>
+            <w:r>
+              <w:rPr>
+                <w:b w:val="false"/>
+                <w:bCs w:val="false"/>
+                <w:color w:val="000000"/>
+                <w:sz w:val="20"/>
+                <w:szCs w:val="20"/>
+              </w:rPr>
+              <w:t xml:space="preserve">Disponibilitat</w:t>
+            </w:r>
+          </w:p>
+        </w:tc>
+        <w:tc>
+          <w:tcPr>
+            <w:tcW w:type="dxa" w:w="240"/>
+            <w:shd w:fill="FFFFFF" w:val="clear"/>
+          </w:tcPr>
+          <w:p>
+            <w:r>
+              <w:rPr>
+                <w:b w:val="false"/>
+                <w:bCs w:val="false"/>
+                <w:color w:val="000000"/>
+                <w:sz w:val="20"/>
+                <w:szCs w:val="20"/>
+              </w:rPr>
+              <w:t xml:space="preserve">Depèn dels equips propis</w:t>
+            </w:r>
+          </w:p>
+        </w:tc>
+        <w:tc>
+          <w:tcPr>
+            <w:tcW w:type="dxa" w:w="240"/>
+            <w:shd w:fill="FFFFFF" w:val="clear"/>
+          </w:tcPr>
+          <w:p>
+            <w:r>
+              <w:rPr>
+                <w:b w:val="false"/>
+                <w:bCs w:val="false"/>
+                <w:color w:val="000000"/>
+                <w:sz w:val="20"/>
+                <w:szCs w:val="20"/>
+              </w:rPr>
+              <w:t xml:space="preserve">Molt alta (centres de dades redundants)</w:t>
+            </w:r>
+          </w:p>
+        </w:tc>
+      </w:tr>
+      <w:tr>
+        <w:trPr>
+          <w:cantSplit/>
+        </w:trPr>
+        <w:tc>
+          <w:tcPr>
+            <w:tcW w:type="dxa" w:w="120"/>
+            <w:shd w:fill="FFFFFF" w:val="clear"/>
+          </w:tcPr>
+          <w:p>
+            <w:r>
+              <w:rPr>
+                <w:b w:val="false"/>
+                <w:bCs w:val="false"/>
+                <w:color w:val="000000"/>
+                <w:sz w:val="20"/>
+                <w:szCs w:val="20"/>
+              </w:rPr>
+              <w:t xml:space="preserve">Control i seguretat</w:t>
+            </w:r>
+          </w:p>
+        </w:tc>
+        <w:tc>
+          <w:tcPr>
+            <w:tcW w:type="dxa" w:w="240"/>
+            <w:shd w:fill="FFFFFF" w:val="clear"/>
+          </w:tcPr>
+          <w:p>
+            <w:r>
+              <w:rPr>
+                <w:b w:val="false"/>
+                <w:bCs w:val="false"/>
+                <w:color w:val="000000"/>
+                <w:sz w:val="20"/>
+                <w:szCs w:val="20"/>
+              </w:rPr>
+              <w:t xml:space="preserve">Control total, però responsabilitat total</w:t>
+            </w:r>
+          </w:p>
+        </w:tc>
+        <w:tc>
+          <w:tcPr>
+            <w:tcW w:type="dxa" w:w="240"/>
+            <w:shd w:fill="FFFFFF" w:val="clear"/>
+          </w:tcPr>
+          <w:p>
+            <w:r>
+              <w:rPr>
+                <w:b w:val="false"/>
+                <w:bCs w:val="false"/>
+                <w:color w:val="000000"/>
+                <w:sz w:val="20"/>
+                <w:szCs w:val="20"/>
+              </w:rPr>
+              <w:t xml:space="preserve">Delegats al proveïdor</w:t>
+            </w:r>
+          </w:p>
+        </w:tc>
+      </w:tr>
+      <w:tr>
+        <w:trPr>
+          <w:cantSplit/>
+        </w:trPr>
+        <w:tc>
+          <w:tcPr>
+            <w:tcW w:type="dxa" w:w="120"/>
+            <w:shd w:fill="FFFFFF" w:val="clear"/>
+          </w:tcPr>
+          <w:p>
+            <w:r>
+              <w:rPr>
+                <w:b w:val="false"/>
+                <w:bCs w:val="false"/>
+                <w:color w:val="000000"/>
+                <w:sz w:val="20"/>
+                <w:szCs w:val="20"/>
+              </w:rPr>
+              <w:t xml:space="preserve">Depèn de</w:t>
+            </w:r>
+          </w:p>
+        </w:tc>
+        <w:tc>
+          <w:tcPr>
+            <w:tcW w:type="dxa" w:w="240"/>
+            <w:shd w:fill="FFFFFF" w:val="clear"/>
+          </w:tcPr>
+          <w:p>
+            <w:r>
+              <w:rPr>
+                <w:b w:val="false"/>
+                <w:bCs w:val="false"/>
+                <w:color w:val="000000"/>
+                <w:sz w:val="20"/>
+                <w:szCs w:val="20"/>
+              </w:rPr>
+              <w:t xml:space="preserve">Maquinari i personal tècnic</w:t>
+            </w:r>
+          </w:p>
+        </w:tc>
+        <w:tc>
+          <w:tcPr>
+            <w:tcW w:type="dxa" w:w="240"/>
+            <w:shd w:fill="FFFFFF" w:val="clear"/>
+          </w:tcPr>
+          <w:p>
+            <w:r>
+              <w:rPr>
+                <w:b w:val="false"/>
+                <w:bCs w:val="false"/>
+                <w:color w:val="000000"/>
+                <w:sz w:val="20"/>
+                <w:szCs w:val="20"/>
+              </w:rPr>
+              <w:t xml:space="preserve">Connexió a Internet i proveïdor</w:t>
+            </w:r>
+          </w:p>
+        </w:tc>
+      </w:tr>
+    </w:tbl>
+    <w:p>
+      <w:pPr>
+        <w:spacing w:after="180" w:line="300"/>
+        <w:jc w:val="both"/>
+      </w:pPr>
+      <w:r>
+        <w:rPr>
+          <w:i/>
+          <w:iCs/>
+          <w:sz w:val="18"/>
+          <w:szCs w:val="18"/>
+        </w:rPr>
+        <w:t xml:space="preserve"/>
+      </w:r>
+    </w:p>
+    <w:p>
+      <w:pPr>
+        <w:pStyle w:val="Heading2"/>
+        <w:spacing w:after="140" w:before="260"/>
+      </w:pPr>
+      <w:r>
+        <w:rPr/>
+        <w:t xml:space="preserve">6.2. El model híbrid</w:t>
+      </w:r>
+    </w:p>
+    <w:p>
+      <w:pPr>
+        <w:spacing w:after="180" w:line="300"/>
+        <w:jc w:val="both"/>
+      </w:pPr>
+      <w:r>
+        <w:rPr>
+          <w:sz w:val="22"/>
+          <w:szCs w:val="22"/>
+        </w:rPr>
+        <w:t xml:space="preserve">Moltes empreses combinen tots dos models: guarden en local les dades sensibles i les que necessiten més velocitat, i fan servir el núvol per a les còpies de seguretat fora de l'empresa i per créixer quan cal (per exemple, en moments de més feina o per col·laborar amb personal que treballa a distància).</w:t>
       </w:r>
     </w:p>
     <w:p>
@@ -2044,7 +3465,7 @@
           <w:sz w:val="22"/>
           <w:szCs w:val="22"/>
         </w:rPr>
-        <w:t xml:space="preserve">La redundància es pot aconseguir amb RAID (local), emmagatzematge en xarxa, o serveis de núvol.</w:t>
+        <w:t xml:space="preserve">Els tres paràmetres bàsics de l'emmagatzematge són el rendiment (latència, IOPS, throughput), la disponibilitat i l'accessibilitat.</w:t>
       </w:r>
     </w:p>
     <w:p>
@@ -2061,7 +3482,7 @@
           <w:sz w:val="22"/>
           <w:szCs w:val="22"/>
         </w:rPr>
-        <w:t xml:space="preserve">RAID 0 dona velocitat sense redundància; RAID 1 dona redundància total a costa de la meitat de la capacitat; RAID 5/6 ofereixen un equilibri mitjançant paritat; RAID 10 combina velocitat i redundància al preu de més discos.</w:t>
+        <w:t xml:space="preserve">HDD &lt; SSD SATA &lt; NVMe en rendiment; SMART permet detectar un disc que s'està degradant abans que falli.</w:t>
       </w:r>
     </w:p>
     <w:p>
@@ -2078,7 +3499,7 @@
           <w:sz w:val="22"/>
           <w:szCs w:val="22"/>
         </w:rPr>
-        <w:t xml:space="preserve">DAS &lt; NAS &lt; SAN: complexitat i cost creixents, a canvi de més rendiment, disponibilitat i escalabilitat.</w:t>
+        <w:t xml:space="preserve">La redundància es pot aconseguir amb RAID (local), emmagatzematge en xarxa, o serveis de núvol.</w:t>
       </w:r>
     </w:p>
     <w:p>
@@ -2095,7 +3516,58 @@
           <w:sz w:val="22"/>
           <w:szCs w:val="22"/>
         </w:rPr>
+        <w:t xml:space="preserve">RAID 0 dona velocitat sense redundància; RAID 1 dona redundància total a costa de la meitat de la capacitat; RAID 5/6 ofereixen un equilibri mitjançant paritat; RAID 10 combina velocitat i redundància al preu de més discos.</w:t>
+      </w:r>
+    </w:p>
+    <w:p>
+      <w:pPr>
+        <w:pStyle w:val="ListParagraph"/>
+        <w:numPr>
+          <w:ilvl w:val="0"/>
+          <w:numId w:val="1"/>
+        </w:numPr>
+        <w:spacing w:after="100" w:line="280"/>
+      </w:pPr>
+      <w:r>
+        <w:rPr>
+          <w:sz w:val="22"/>
+          <w:szCs w:val="22"/>
+        </w:rPr>
+        <w:t xml:space="preserve">DAS &lt; NAS &lt; SAN: complexitat i cost creixents, a canvi de més rendiment, disponibilitat i escalabilitat.</w:t>
+      </w:r>
+    </w:p>
+    <w:p>
+      <w:pPr>
+        <w:pStyle w:val="ListParagraph"/>
+        <w:numPr>
+          <w:ilvl w:val="0"/>
+          <w:numId w:val="1"/>
+        </w:numPr>
+        <w:spacing w:after="100" w:line="280"/>
+      </w:pPr>
+      <w:r>
+        <w:rPr>
+          <w:sz w:val="22"/>
+          <w:szCs w:val="22"/>
+        </w:rPr>
         <w:t xml:space="preserve">Els serveis de núvol són còmodes i barats, però cal valorar-ne la velocitat, el control de les dades i el compliment legal.</w:t>
+      </w:r>
+    </w:p>
+    <w:p>
+      <w:pPr>
+        <w:pStyle w:val="ListParagraph"/>
+        <w:numPr>
+          <w:ilvl w:val="0"/>
+          <w:numId w:val="1"/>
+        </w:numPr>
+        <w:spacing w:after="100" w:line="280"/>
+      </w:pPr>
+      <w:r>
+        <w:rPr>
+          <w:sz w:val="22"/>
+          <w:szCs w:val="22"/>
+        </w:rPr>
+        <w:t xml:space="preserve">Local i núvol tenen avantatges diferents; el model híbrid els combina.</w:t>
       </w:r>
     </w:p>
     <w:p>

</xml_diff>

<commit_message>
RA2-AA2: explica com funciona la paritat del RAID 5 (analogia amb sumes i XOR) al temari T02 i en una diapositiva nova
Co-Authored-By: Claude Opus 5.5 <noreply@anthropic.com>
Claude-Session: https://claude.ai/code/session_01BodJZ9PsepvknsFhsdyYkP
</commit_message>
<xml_diff>
--- a/RA2 - Emmagatzematge i copies de seguretat/AA2 - Sistemes demmagatzematge/T02_Temari_Sistemes_emmagatzematge.docx
+++ b/RA2 - Emmagatzematge i copies de seguretat/AA2 - Sistemes demmagatzematge/T02_Temari_Sistemes_emmagatzematge.docx
@@ -1436,6 +1436,324 @@
           <w:sz w:val="19"/>
         </w:rPr>
         <w:t>RAID 5 — Paritat distribuïda.</w:t>
+      </w:r>
+    </w:p>
+    <w:p>
+      <w:pPr>
+        <w:spacing w:after="180" w:line="300" w:before="240"/>
+        <w:jc w:val="both"/>
+      </w:pPr>
+      <w:r>
+        <w:rPr>
+          <w:b/>
+          <w:sz w:val="22"/>
+          <w:szCs w:val="22"/>
+        </w:rPr>
+        <w:t xml:space="preserve">Com funciona la paritat?</w:t>
+      </w:r>
+    </w:p>
+    <w:p>
+      <w:pPr>
+        <w:spacing w:after="180" w:line="300"/>
+        <w:jc w:val="both"/>
+      </w:pPr>
+      <w:r>
+        <w:rPr>
+          <w:sz w:val="22"/>
+          <w:szCs w:val="22"/>
+        </w:rPr>
+        <w:t xml:space="preserve">Una analogia amb sumes ajuda a entendre-ho. Imagina que has de guardar dos números, 3 i 5, i tens tres caixes:</w:t>
+      </w:r>
+    </w:p>
+    <w:tbl>
+      <w:tblPr>
+        <w:tblW w:type="dxa" w:w="9000"/>
+        <w:tblBorders>
+          <w:top w:val="single" w:color="auto" w:sz="4"/>
+          <w:left w:val="single" w:color="auto" w:sz="4"/>
+          <w:bottom w:val="single" w:color="auto" w:sz="4"/>
+          <w:right w:val="single" w:color="auto" w:sz="4"/>
+          <w:insideH w:val="single" w:color="auto" w:sz="4"/>
+          <w:insideV w:val="single" w:color="auto" w:sz="4"/>
+        </w:tblBorders>
+      </w:tblPr>
+      <w:tblGrid>
+        <w:gridCol w:w="120"/>
+        <w:gridCol w:w="240"/>
+        <w:gridCol w:w="240"/>
+      </w:tblGrid>
+      <w:tr>
+        <w:trPr>
+          <w:cantSplit/>
+        </w:trPr>
+        <w:tc>
+          <w:tcPr>
+            <w:tcW w:type="dxa" w:w="120"/>
+            <w:shd w:fill="16242E" w:val="clear"/>
+          </w:tcPr>
+          <w:p>
+            <w:r>
+              <w:rPr>
+                <w:b/>
+                <w:bCs/>
+                <w:color w:val="FFFFFF"/>
+                <w:sz w:val="20"/>
+                <w:szCs w:val="20"/>
+              </w:rPr>
+              <w:t xml:space="preserve">Caixa A</w:t>
+            </w:r>
+          </w:p>
+        </w:tc>
+        <w:tc>
+          <w:tcPr>
+            <w:tcW w:type="dxa" w:w="240"/>
+            <w:shd w:fill="16242E" w:val="clear"/>
+          </w:tcPr>
+          <w:p>
+            <w:r>
+              <w:rPr>
+                <w:b/>
+                <w:bCs/>
+                <w:color w:val="FFFFFF"/>
+                <w:sz w:val="20"/>
+                <w:szCs w:val="20"/>
+              </w:rPr>
+              <w:t xml:space="preserve">Caixa B</w:t>
+            </w:r>
+          </w:p>
+        </w:tc>
+        <w:tc>
+          <w:tcPr>
+            <w:tcW w:type="dxa" w:w="240"/>
+            <w:shd w:fill="16242E" w:val="clear"/>
+          </w:tcPr>
+          <w:p>
+            <w:r>
+              <w:rPr>
+                <w:b/>
+                <w:bCs/>
+                <w:color w:val="FFFFFF"/>
+                <w:sz w:val="20"/>
+                <w:szCs w:val="20"/>
+              </w:rPr>
+              <w:t xml:space="preserve">Caixa C (paritat)</w:t>
+            </w:r>
+          </w:p>
+        </w:tc>
+      </w:tr>
+      <w:tr>
+        <w:trPr>
+          <w:cantSplit/>
+        </w:trPr>
+        <w:tc>
+          <w:tcPr>
+            <w:tcW w:type="dxa" w:w="120"/>
+            <w:shd w:fill="FFFFFF" w:val="clear"/>
+          </w:tcPr>
+          <w:p>
+            <w:r>
+              <w:rPr>
+                <w:b w:val="false"/>
+                <w:bCs w:val="false"/>
+                <w:color w:val="000000"/>
+                <w:sz w:val="20"/>
+                <w:szCs w:val="20"/>
+              </w:rPr>
+              <w:t xml:space="preserve">3</w:t>
+            </w:r>
+          </w:p>
+        </w:tc>
+        <w:tc>
+          <w:tcPr>
+            <w:tcW w:type="dxa" w:w="240"/>
+            <w:shd w:fill="FFFFFF" w:val="clear"/>
+          </w:tcPr>
+          <w:p>
+            <w:r>
+              <w:rPr>
+                <w:b w:val="false"/>
+                <w:bCs w:val="false"/>
+                <w:color w:val="000000"/>
+                <w:sz w:val="20"/>
+                <w:szCs w:val="20"/>
+              </w:rPr>
+              <w:t xml:space="preserve">5</w:t>
+            </w:r>
+          </w:p>
+        </w:tc>
+        <w:tc>
+          <w:tcPr>
+            <w:tcW w:type="dxa" w:w="240"/>
+            <w:shd w:fill="FFFFFF" w:val="clear"/>
+          </w:tcPr>
+          <w:p>
+            <w:r>
+              <w:rPr>
+                <w:b w:val="false"/>
+                <w:bCs w:val="false"/>
+                <w:color w:val="000000"/>
+                <w:sz w:val="20"/>
+                <w:szCs w:val="20"/>
+              </w:rPr>
+              <w:t xml:space="preserve">8 (= 3 + 5)</w:t>
+            </w:r>
+          </w:p>
+        </w:tc>
+      </w:tr>
+    </w:tbl>
+    <w:p>
+      <w:pPr>
+        <w:pStyle w:val="ListParagraph"/>
+        <w:numPr>
+          <w:ilvl w:val="0"/>
+          <w:numId w:val="1"/>
+        </w:numPr>
+        <w:spacing w:after="100" w:line="280" w:before="120"/>
+      </w:pPr>
+      <w:r>
+        <w:rPr>
+          <w:sz w:val="22"/>
+          <w:szCs w:val="22"/>
+        </w:rPr>
+        <w:t xml:space="preserve">Si es perd la caixa A: 8 − 5 = 3. Recuperat.</w:t>
+      </w:r>
+    </w:p>
+    <w:p>
+      <w:pPr>
+        <w:pStyle w:val="ListParagraph"/>
+        <w:numPr>
+          <w:ilvl w:val="0"/>
+          <w:numId w:val="1"/>
+        </w:numPr>
+        <w:spacing w:after="100" w:line="280"/>
+      </w:pPr>
+      <w:r>
+        <w:rPr>
+          <w:sz w:val="22"/>
+          <w:szCs w:val="22"/>
+        </w:rPr>
+        <w:t xml:space="preserve">Si es perd la caixa B: 8 − 3 = 5. Recuperat.</w:t>
+      </w:r>
+    </w:p>
+    <w:p>
+      <w:pPr>
+        <w:pStyle w:val="ListParagraph"/>
+        <w:numPr>
+          <w:ilvl w:val="0"/>
+          <w:numId w:val="1"/>
+        </w:numPr>
+        <w:spacing w:after="100" w:line="280"/>
+      </w:pPr>
+      <w:r>
+        <w:rPr>
+          <w:sz w:val="22"/>
+          <w:szCs w:val="22"/>
+        </w:rPr>
+        <w:t xml:space="preserve">Si es perd la caixa C: es torna a calcular, 3 + 5 = 8.</w:t>
+      </w:r>
+    </w:p>
+    <w:p>
+      <w:pPr>
+        <w:pStyle w:val="ListParagraph"/>
+        <w:numPr>
+          <w:ilvl w:val="0"/>
+          <w:numId w:val="1"/>
+        </w:numPr>
+        <w:spacing w:after="100" w:line="280"/>
+      </w:pPr>
+      <w:r>
+        <w:rPr>
+          <w:sz w:val="22"/>
+          <w:szCs w:val="22"/>
+        </w:rPr>
+        <w:t xml:space="preserve">Si es perden dues caixes alhora, ja no es pot calcular res. Per això el RAID 5 només suporta la fallada d'un disc.</w:t>
+      </w:r>
+    </w:p>
+    <w:p>
+      <w:pPr>
+        <w:spacing w:after="180" w:line="300"/>
+        <w:jc w:val="both"/>
+      </w:pPr>
+      <w:r>
+        <w:rPr>
+          <w:sz w:val="22"/>
+          <w:szCs w:val="22"/>
+        </w:rPr>
+        <w:t xml:space="preserve">El RAID 5 fa exactament això, però en comptes de la suma fa servir l'operació </w:t>
+      </w:r>
+      <w:r>
+        <w:rPr>
+          <w:b/>
+          <w:sz w:val="22"/>
+          <w:szCs w:val="22"/>
+        </w:rPr>
+        <w:t xml:space="preserve">XOR</w:t>
+      </w:r>
+      <w:r>
+        <w:rPr>
+          <w:sz w:val="22"/>
+          <w:szCs w:val="22"/>
+        </w:rPr>
+        <w:t xml:space="preserve">, a nivell de bits:</w:t>
+      </w:r>
+    </w:p>
+    <w:p>
+      <w:pPr>
+        <w:spacing w:after="180" w:line="300"/>
+        <w:jc w:val="left"/>
+      </w:pPr>
+      <w:r>
+        <w:rPr>
+          <w:rFonts w:ascii="Consolas" w:hAnsi="Consolas" w:cs="Consolas"/>
+          <w:sz w:val="18"/>
+          <w:szCs w:val="22"/>
+        </w:rPr>
+        <w:t xml:space="preserve">Disc 1:   1 0 1 1</w:t>
+      </w:r>
+      <w:r>
+        <w:rPr>
+          <w:rFonts w:ascii="Consolas" w:hAnsi="Consolas" w:cs="Consolas"/>
+          <w:sz w:val="18"/>
+          <w:szCs w:val="22"/>
+        </w:rPr>
+        <w:br/>
+      </w:r>
+      <w:r>
+        <w:rPr>
+          <w:rFonts w:ascii="Consolas" w:hAnsi="Consolas" w:cs="Consolas"/>
+          <w:sz w:val="18"/>
+          <w:szCs w:val="22"/>
+        </w:rPr>
+        <w:t xml:space="preserve">Disc 2:   0 1 1 0</w:t>
+      </w:r>
+      <w:r>
+        <w:rPr>
+          <w:rFonts w:ascii="Consolas" w:hAnsi="Consolas" w:cs="Consolas"/>
+          <w:sz w:val="18"/>
+          <w:szCs w:val="22"/>
+        </w:rPr>
+        <w:br/>
+      </w:r>
+      <w:r>
+        <w:rPr>
+          <w:rFonts w:ascii="Consolas" w:hAnsi="Consolas" w:cs="Consolas"/>
+          <w:sz w:val="18"/>
+          <w:szCs w:val="22"/>
+        </w:rPr>
+        <w:t xml:space="preserve">Paritat:  1 1 0 1   (XOR: 1 si els bits són diferents, 0 si són iguals)</w:t>
+      </w:r>
+    </w:p>
+    <w:p>
+      <w:pPr>
+        <w:spacing w:after="180" w:line="300"/>
+        <w:jc w:val="both"/>
+      </w:pPr>
+      <w:r>
+        <w:rPr>
+          <w:sz w:val="22"/>
+          <w:szCs w:val="22"/>
+        </w:rPr>
+        <w:t xml:space="preserve">Si es perd el disc 1, en fer el XOR del disc 2 amb la paritat surt 1 0 1 1, que és el contingut original.</w:t>
       </w:r>
     </w:p>
     <w:p>

</xml_diff>

<commit_message>
RA2-AA2: afegeix una frase resum per a DAS, NAS i SAN al temari T02
Co-Authored-By: Claude Opus 5.5 <noreply@anthropic.com>
Claude-Session: https://claude.ai/code/session_01BodJZ9PsepvknsFhsdyYkP
</commit_message>
<xml_diff>
--- a/RA2 - Emmagatzematge i copies de seguretat/AA2 - Sistemes demmagatzematge/T02_Temari_Sistemes_emmagatzematge.docx
+++ b/RA2 - Emmagatzematge i copies de seguretat/AA2 - Sistemes demmagatzematge/T02_Temari_Sistemes_emmagatzematge.docx
@@ -2907,6 +2907,27 @@
       </w:pPr>
       <w:r>
         <w:rPr>
+          <w:b/>
+          <w:sz w:val="22"/>
+          <w:szCs w:val="22"/>
+        </w:rPr>
+        <w:t xml:space="preserve">En una frase: </w:t>
+      </w:r>
+      <w:r>
+        <w:rPr>
+          <w:sz w:val="22"/>
+          <w:szCs w:val="22"/>
+        </w:rPr>
+        <w:t xml:space="preserve">Un DAS és com un «armari de discos» connectat directament a un sol servidor: només aquell servidor el pot fer servir i, si vol que els altres equips hi accedeixin, ha de compartir-ne les carpetes ell mateix per la xarxa.</w:t>
+      </w:r>
+    </w:p>
+    <w:p>
+      <w:pPr>
+        <w:spacing w:after="180" w:line="300"/>
+        <w:jc w:val="both"/>
+      </w:pPr>
+      <w:r>
+        <w:rPr>
           <w:sz w:val="22"/>
           <w:szCs w:val="22"/>
         </w:rPr>
@@ -3052,6 +3073,27 @@
     </w:p>
     <w:p>
       <w:pPr>
+        <w:spacing w:after="180" w:line="300"/>
+        <w:jc w:val="both"/>
+      </w:pPr>
+      <w:r>
+        <w:rPr>
+          <w:b/>
+          <w:sz w:val="22"/>
+          <w:szCs w:val="22"/>
+        </w:rPr>
+        <w:t xml:space="preserve">En una frase: </w:t>
+      </w:r>
+      <w:r>
+        <w:rPr>
+          <w:sz w:val="22"/>
+          <w:szCs w:val="22"/>
+        </w:rPr>
+        <w:t xml:space="preserve">Un NAS és com un «armari de discos» amb cervell propi, connectat a la xarxa perquè tothom hi pugui guardar i agafar fitxers.</w:t>
+      </w:r>
+    </w:p>
+    <w:p>
+      <w:pPr>
         <w:jc w:val="center"/>
       </w:pPr>
       <w:r>
@@ -3122,6 +3164,27 @@
           <w:szCs w:val="22"/>
         </w:rPr>
         <w:t xml:space="preserve">Són xarxes dedicades exclusivament a l'emmagatzematge de dades, molt més complexes i costoses que una solució NAS, però amb un rendiment molt superior. S'utilitzen en entorns empresarials amb grans volums de dades i necessitats de rendiment molt elevades. Connecten servidors amb dispositius d'emmagatzematge (cabines de discos, cintes...) fent que els servidors hi accedeixin com si els discos fossin locals.</w:t>
+      </w:r>
+    </w:p>
+    <w:p>
+      <w:pPr>
+        <w:spacing w:after="180" w:line="300"/>
+        <w:jc w:val="both"/>
+      </w:pPr>
+      <w:r>
+        <w:rPr>
+          <w:b/>
+          <w:sz w:val="22"/>
+          <w:szCs w:val="22"/>
+        </w:rPr>
+        <w:t xml:space="preserve">En una frase: </w:t>
+      </w:r>
+      <w:r>
+        <w:rPr>
+          <w:sz w:val="22"/>
+          <w:szCs w:val="22"/>
+        </w:rPr>
+        <w:t xml:space="preserve">Una SAN és com un «magatzem central» amb carreteres pròpies: els servidors hi reben discos sencers per una xarxa exclusiva i els fan servir com si fossin seus.</w:t>
       </w:r>
     </w:p>
     <w:p>

</xml_diff>

<commit_message>
RA2-AA2: explica les LUN a l'apartat de SAN del temari T02
Co-Authored-By: Claude Opus 5.5 <noreply@anthropic.com>
Claude-Session: https://claude.ai/code/session_01BodJZ9PsepvknsFhsdyYkP
</commit_message>
<xml_diff>
--- a/RA2 - Emmagatzematge i copies de seguretat/AA2 - Sistemes demmagatzematge/T02_Temari_Sistemes_emmagatzematge.docx
+++ b/RA2 - Emmagatzematge i copies de seguretat/AA2 - Sistemes demmagatzematge/T02_Temari_Sistemes_emmagatzematge.docx
@@ -3185,6 +3185,61 @@
           <w:szCs w:val="22"/>
         </w:rPr>
         <w:t xml:space="preserve">Una SAN és com un «magatzem central» amb carreteres pròpies: els servidors hi reben discos sencers per una xarxa exclusiva i els fan servir com si fossin seus.</w:t>
+      </w:r>
+    </w:p>
+    <w:p>
+      <w:pPr>
+        <w:spacing w:after="180" w:line="300"/>
+        <w:jc w:val="both"/>
+      </w:pPr>
+      <w:r>
+        <w:rPr>
+          <w:b/>
+          <w:sz w:val="22"/>
+          <w:szCs w:val="22"/>
+        </w:rPr>
+        <w:t xml:space="preserve">Com es reparteix l'espai: les LUN. </w:t>
+      </w:r>
+      <w:r>
+        <w:rPr>
+          <w:sz w:val="22"/>
+          <w:szCs w:val="22"/>
+        </w:rPr>
+        <w:t xml:space="preserve">En una SAN no es reserva un disc físic per a cada servidor. Tots els discos de la cabina s'agrupen (normalment amb RAID) en un gran conjunt d'espai, i d'aquest conjunt es tallen «discos virtuals» de la mida que calgui, anomenats LUN (Logical Unit Number). Cada LUN s'assigna a un o més servidors, que la veuen com si fos un disc local seu (per exemple, /dev/sdb), la formaten i la fan servir sense saber en quins discos físics és realment.</w:t>
+      </w:r>
+    </w:p>
+    <w:p>
+      <w:pPr>
+        <w:pStyle w:val="ListParagraph"/>
+        <w:numPr>
+          <w:ilvl w:val="0"/>
+          <w:numId w:val="1"/>
+        </w:numPr>
+        <w:spacing w:after="100" w:line="280"/>
+      </w:pPr>
+      <w:r>
+        <w:rPr>
+          <w:sz w:val="22"/>
+          <w:szCs w:val="22"/>
+        </w:rPr>
+        <w:t xml:space="preserve">Exemple: amb 24 discos de 4 TB en RAID 6 (uns 88 TB útils), es pot donar una LUN de 2 TB al servidor de bases de dades, una de 10 TB al de virtualització i una de 500 GB al de correu, i ampliar-les més endavant si cal.</w:t>
+      </w:r>
+    </w:p>
+    <w:p>
+      <w:pPr>
+        <w:pStyle w:val="ListParagraph"/>
+        <w:numPr>
+          <w:ilvl w:val="0"/>
+          <w:numId w:val="1"/>
+        </w:numPr>
+        <w:spacing w:after="100" w:line="280"/>
+      </w:pPr>
+      <w:r>
+        <w:rPr>
+          <w:sz w:val="22"/>
+          <w:szCs w:val="22"/>
+        </w:rPr>
+        <w:t xml:space="preserve">És la mateixa idea que LVM a Linux (un grup de volums del qual es tallen volums lògics), però a gran escala i lliurant els volums als servidors per una xarxa dedicada.</w:t>
       </w:r>
     </w:p>
     <w:p>

</xml_diff>